<commit_message>
Release estável: inventário por setor e módulos revisados
</commit_message>
<xml_diff>
--- a/data/reference/etiqueta_caixas.docx
+++ b/data/reference/etiqueta_caixas.docx
@@ -78,10 +78,12 @@
                 <w:lang w:eastAsia="pt-BR"/>
               </w:rPr>
               <w:drawing>
-                <wp:inline distT="0" distB="0" distL="0" distR="0" wp14:anchorId="48732852" wp14:editId="04DE9E4B">
+                <wp:inline distT="0" distB="0" distL="0" distR="0" wp14:anchorId="48732852" wp14:editId="01ACF870">
                   <wp:extent cx="2142490" cy="832485"/>
                   <wp:effectExtent l="0" t="0" r="0" b="5715"/>
-                  <wp:docPr id="2" name="Imagem 2"/>
+                  <wp:docPr id="2" name="Imagem 2">
+                    <a:hlinkClick xmlns:a="http://schemas.openxmlformats.org/drawingml/2006/main" r:id="rId7"/>
+                  </wp:docPr>
                   <wp:cNvGraphicFramePr>
                     <a:graphicFrameLocks xmlns:a="http://schemas.openxmlformats.org/drawingml/2006/main" noChangeAspect="1"/>
                   </wp:cNvGraphicFramePr>
@@ -89,13 +91,15 @@
                     <a:graphicData uri="http://schemas.openxmlformats.org/drawingml/2006/picture">
                       <pic:pic xmlns:pic="http://schemas.openxmlformats.org/drawingml/2006/picture">
                         <pic:nvPicPr>
-                          <pic:cNvPr id="0" name="Imagem 1"/>
+                          <pic:cNvPr id="2" name="Imagem 2">
+                            <a:hlinkClick r:id="rId7"/>
+                          </pic:cNvPr>
                           <pic:cNvPicPr>
                             <a:picLocks noChangeAspect="1" noChangeArrowheads="1"/>
                           </pic:cNvPicPr>
                         </pic:nvPicPr>
                         <pic:blipFill>
-                          <a:blip r:embed="rId7" cstate="print">
+                          <a:blip r:embed="rId8" cstate="print">
                             <a:extLst>
                               <a:ext uri="{28A0092B-C50C-407E-A947-70E740481C1C}">
                                 <a14:useLocalDpi xmlns:a14="http://schemas.microsoft.com/office/drawing/2010/main" val="0"/>
@@ -1702,7 +1706,7 @@
       </w:pPr>
     </w:p>
     <w:sectPr>
-      <w:headerReference w:type="default" r:id="rId8"/>
+      <w:headerReference w:type="default" r:id="rId9"/>
       <w:pgSz w:w="11906" w:h="16838"/>
       <w:pgMar w:top="1276" w:right="1274" w:bottom="0" w:left="1134" w:header="708" w:footer="708" w:gutter="0"/>
       <w:cols w:space="708"/>

</xml_diff>

<commit_message>
add: geração DOCX com logo
</commit_message>
<xml_diff>
--- a/data/reference/etiqueta_caixas.docx
+++ b/data/reference/etiqueta_caixas.docx
@@ -49,22 +49,54 @@
           <w:insideV w:val="thinThickSmallGap" w:sz="24" w:space="0" w:color="auto"/>
         </w:tblBorders>
         <w:tblLook w:val="01E0" w:firstRow="1" w:lastRow="1" w:firstColumn="1" w:lastColumn="1" w:noHBand="0" w:noVBand="0"/>
+        <w:tblPrChange w:id="0" w:author="KETRY GORETE FARIAS DOS PASSOS" w:date="2026-05-04T10:04:00Z">
+          <w:tblPr>
+            <w:tblpPr w:leftFromText="141" w:rightFromText="141" w:vertAnchor="text" w:horzAnchor="margin" w:tblpXSpec="center" w:tblpY="1"/>
+            <w:tblOverlap w:val="never"/>
+            <w:tblW w:w="6918" w:type="dxa"/>
+            <w:tblBorders>
+              <w:top w:val="thinThickSmallGap" w:sz="24" w:space="0" w:color="auto"/>
+              <w:left w:val="thinThickSmallGap" w:sz="24" w:space="0" w:color="auto"/>
+              <w:bottom w:val="thinThickSmallGap" w:sz="24" w:space="0" w:color="auto"/>
+              <w:right w:val="thinThickSmallGap" w:sz="24" w:space="0" w:color="auto"/>
+              <w:insideH w:val="thinThickSmallGap" w:sz="24" w:space="0" w:color="auto"/>
+              <w:insideV w:val="thinThickSmallGap" w:sz="24" w:space="0" w:color="auto"/>
+            </w:tblBorders>
+            <w:tblLook w:val="01E0" w:firstRow="1" w:lastRow="1" w:firstColumn="1" w:lastColumn="1" w:noHBand="0" w:noVBand="0"/>
+          </w:tblPr>
+        </w:tblPrChange>
       </w:tblPr>
       <w:tblGrid>
         <w:gridCol w:w="6918"/>
+        <w:tblGridChange w:id="1">
+          <w:tblGrid>
+            <w:gridCol w:w="6918"/>
+          </w:tblGrid>
+        </w:tblGridChange>
       </w:tblGrid>
       <w:tr>
         <w:trPr>
-          <w:trHeight w:val="1940"/>
+          <w:trHeight w:val="1470"/>
+          <w:trPrChange w:id="2" w:author="KETRY GORETE FARIAS DOS PASSOS" w:date="2026-05-04T10:04:00Z">
+            <w:trPr>
+              <w:trHeight w:val="1940"/>
+            </w:trPr>
+          </w:trPrChange>
         </w:trPr>
         <w:tc>
           <w:tcPr>
             <w:tcW w:w="6918" w:type="dxa"/>
+            <w:tcPrChange w:id="3" w:author="KETRY GORETE FARIAS DOS PASSOS" w:date="2026-05-04T10:04:00Z">
+              <w:tcPr>
+                <w:tcW w:w="6918" w:type="dxa"/>
+              </w:tcPr>
+            </w:tcPrChange>
           </w:tcPr>
           <w:p>
             <w:pPr>
               <w:jc w:val="center"/>
               <w:rPr>
+                <w:del w:id="4" w:author="KETRY GORETE FARIAS DOS PASSOS" w:date="2026-05-04T10:04:00Z"/>
                 <w:noProof/>
                 <w:sz w:val="40"/>
                 <w:szCs w:val="40"/>
@@ -140,42 +172,16 @@
                 <w:szCs w:val="40"/>
               </w:rPr>
             </w:pPr>
-            <w:proofErr w:type="gramStart"/>
-            <w:r>
-              <w:rPr>
-                <w:b/>
-                <w:sz w:val="40"/>
-                <w:szCs w:val="40"/>
-              </w:rPr>
-              <w:t xml:space="preserve">{{ </w:t>
-            </w:r>
-            <w:proofErr w:type="spellStart"/>
-            <w:r>
-              <w:rPr>
-                <w:b/>
-                <w:sz w:val="40"/>
-                <w:szCs w:val="40"/>
-              </w:rPr>
-              <w:t>unidade</w:t>
-            </w:r>
-            <w:proofErr w:type="gramEnd"/>
-            <w:r>
-              <w:rPr>
-                <w:b/>
-                <w:sz w:val="40"/>
-                <w:szCs w:val="40"/>
-              </w:rPr>
-              <w:t>_macro</w:t>
-            </w:r>
-            <w:proofErr w:type="spellEnd"/>
-            <w:r>
-              <w:rPr>
-                <w:b/>
-                <w:sz w:val="40"/>
-                <w:szCs w:val="40"/>
-              </w:rPr>
-              <w:t xml:space="preserve"> }}</w:t>
-            </w:r>
+            <w:del w:id="5" w:author="KETRY GORETE FARIAS DOS PASSOS" w:date="2026-05-04T10:04:00Z">
+              <w:r>
+                <w:rPr>
+                  <w:b/>
+                  <w:sz w:val="40"/>
+                  <w:szCs w:val="40"/>
+                </w:rPr>
+                <w:delText>{{ unidade_macro }}</w:delText>
+              </w:r>
+            </w:del>
           </w:p>
         </w:tc>
       </w:tr>
@@ -192,71 +198,46 @@
               <w:spacing w:before="120" w:after="120"/>
               <w:jc w:val="center"/>
               <w:rPr>
+                <w:del w:id="6" w:author="KETRY GORETE FARIAS DOS PASSOS" w:date="2026-05-04T10:04:00Z"/>
                 <w:b/>
                 <w:sz w:val="40"/>
                 <w:szCs w:val="40"/>
               </w:rPr>
             </w:pPr>
-            <w:r>
-              <w:rPr>
-                <w:b/>
-                <w:sz w:val="40"/>
-                <w:szCs w:val="40"/>
-              </w:rPr>
-              <w:t xml:space="preserve">  </w:t>
-            </w:r>
-            <w:proofErr w:type="gramStart"/>
-            <w:r>
-              <w:rPr>
-                <w:b/>
-                <w:sz w:val="40"/>
-                <w:szCs w:val="40"/>
-              </w:rPr>
-              <w:t xml:space="preserve">{{ </w:t>
-            </w:r>
-            <w:proofErr w:type="spellStart"/>
-            <w:r>
-              <w:rPr>
-                <w:b/>
-                <w:sz w:val="40"/>
-                <w:szCs w:val="40"/>
-              </w:rPr>
-              <w:t>setor</w:t>
-            </w:r>
-            <w:proofErr w:type="gramEnd"/>
-            <w:r>
-              <w:rPr>
-                <w:b/>
-                <w:sz w:val="40"/>
-                <w:szCs w:val="40"/>
-              </w:rPr>
-              <w:t>_respo</w:t>
-            </w:r>
-            <w:r>
-              <w:rPr>
-                <w:b/>
-                <w:sz w:val="40"/>
-                <w:szCs w:val="40"/>
-              </w:rPr>
-              <w:t>n</w:t>
-            </w:r>
-            <w:r>
-              <w:rPr>
-                <w:b/>
-                <w:sz w:val="40"/>
-                <w:szCs w:val="40"/>
-              </w:rPr>
-              <w:t>savel</w:t>
-            </w:r>
-            <w:proofErr w:type="spellEnd"/>
-            <w:r>
-              <w:rPr>
-                <w:b/>
-                <w:sz w:val="40"/>
-                <w:szCs w:val="40"/>
-              </w:rPr>
-              <w:t xml:space="preserve"> }}</w:t>
-            </w:r>
+            <w:del w:id="7" w:author="KETRY GORETE FARIAS DOS PASSOS" w:date="2026-05-04T10:04:00Z">
+              <w:r>
+                <w:rPr>
+                  <w:b/>
+                  <w:sz w:val="40"/>
+                  <w:szCs w:val="40"/>
+                </w:rPr>
+                <w:delText xml:space="preserve">  </w:delText>
+              </w:r>
+              <w:r>
+                <w:rPr>
+                  <w:b/>
+                  <w:sz w:val="40"/>
+                  <w:szCs w:val="40"/>
+                </w:rPr>
+                <w:delText>{{ setor_respo</w:delText>
+              </w:r>
+              <w:r>
+                <w:rPr>
+                  <w:b/>
+                  <w:sz w:val="40"/>
+                  <w:szCs w:val="40"/>
+                </w:rPr>
+                <w:delText>n</w:delText>
+              </w:r>
+              <w:r>
+                <w:rPr>
+                  <w:b/>
+                  <w:sz w:val="40"/>
+                  <w:szCs w:val="40"/>
+                </w:rPr>
+                <w:delText>savel }}</w:delText>
+              </w:r>
+            </w:del>
           </w:p>
           <w:p>
             <w:pPr>
@@ -366,174 +347,9 @@
               <w:jc w:val="center"/>
               <w:rPr>
                 <w:bCs/>
-                <w:sz w:val="40"/>
-                <w:szCs w:val="40"/>
-              </w:rPr>
-            </w:pPr>
-            <w:proofErr w:type="gramStart"/>
-            <w:r>
-              <w:rPr>
-                <w:bCs/>
-                <w:sz w:val="40"/>
-                <w:szCs w:val="40"/>
-              </w:rPr>
-              <w:t>{{ assunto</w:t>
-            </w:r>
-            <w:proofErr w:type="gramEnd"/>
-            <w:r>
-              <w:rPr>
-                <w:bCs/>
-                <w:sz w:val="40"/>
-                <w:szCs w:val="40"/>
-              </w:rPr>
-              <w:t xml:space="preserve"> }}</w:t>
-            </w:r>
-          </w:p>
-          <w:p>
-            <w:pPr>
-              <w:jc w:val="center"/>
-              <w:rPr>
-                <w:b/>
-                <w:sz w:val="40"/>
-                <w:szCs w:val="40"/>
-              </w:rPr>
-            </w:pPr>
-            <w:r>
-              <w:rPr>
-                <w:b/>
-                <w:sz w:val="40"/>
-                <w:szCs w:val="40"/>
-              </w:rPr>
-              <w:t>Datas-limite:</w:t>
-            </w:r>
-          </w:p>
-          <w:p>
-            <w:pPr>
-              <w:jc w:val="center"/>
-              <w:rPr>
-                <w:bCs/>
-                <w:sz w:val="40"/>
-                <w:szCs w:val="40"/>
-              </w:rPr>
-            </w:pPr>
-            <w:proofErr w:type="gramStart"/>
-            <w:r>
-              <w:rPr>
-                <w:bCs/>
-                <w:sz w:val="40"/>
-                <w:szCs w:val="40"/>
-              </w:rPr>
-              <w:t xml:space="preserve">{{ </w:t>
-            </w:r>
-            <w:proofErr w:type="spellStart"/>
-            <w:r>
-              <w:rPr>
-                <w:bCs/>
-                <w:sz w:val="40"/>
-                <w:szCs w:val="40"/>
-              </w:rPr>
-              <w:t>datas</w:t>
-            </w:r>
-            <w:proofErr w:type="gramEnd"/>
-            <w:r>
-              <w:rPr>
-                <w:bCs/>
-                <w:sz w:val="40"/>
-                <w:szCs w:val="40"/>
-              </w:rPr>
-              <w:t>_limite</w:t>
-            </w:r>
-            <w:r>
-              <w:rPr>
-                <w:bCs/>
-                <w:sz w:val="40"/>
-                <w:szCs w:val="40"/>
-              </w:rPr>
-              <w:t>_resumo</w:t>
-            </w:r>
-            <w:proofErr w:type="spellEnd"/>
-            <w:r>
-              <w:rPr>
-                <w:bCs/>
-                <w:sz w:val="40"/>
-                <w:szCs w:val="40"/>
-              </w:rPr>
-              <w:t xml:space="preserve"> }}</w:t>
-            </w:r>
-          </w:p>
-          <w:p>
-            <w:pPr>
-              <w:jc w:val="center"/>
-              <w:rPr>
-                <w:b/>
-                <w:sz w:val="40"/>
-                <w:szCs w:val="40"/>
-              </w:rPr>
-            </w:pPr>
-            <w:r>
-              <w:rPr>
-                <w:b/>
-                <w:sz w:val="40"/>
-                <w:szCs w:val="40"/>
-              </w:rPr>
-              <w:t>Destinação:</w:t>
-            </w:r>
-          </w:p>
-          <w:p>
-            <w:pPr>
-              <w:jc w:val="center"/>
-              <w:rPr>
-                <w:bCs/>
-                <w:sz w:val="40"/>
-                <w:szCs w:val="40"/>
-              </w:rPr>
-            </w:pPr>
-            <w:proofErr w:type="gramStart"/>
-            <w:r>
-              <w:rPr>
-                <w:bCs/>
-                <w:sz w:val="40"/>
-                <w:szCs w:val="40"/>
-              </w:rPr>
-              <w:t xml:space="preserve">{{ </w:t>
-            </w:r>
-            <w:proofErr w:type="spellStart"/>
-            <w:r>
-              <w:rPr>
-                <w:bCs/>
-                <w:sz w:val="40"/>
-                <w:szCs w:val="40"/>
-              </w:rPr>
-              <w:t>destinacao</w:t>
-            </w:r>
-            <w:proofErr w:type="spellEnd"/>
-            <w:proofErr w:type="gramEnd"/>
-            <w:r>
-              <w:rPr>
-                <w:bCs/>
-                <w:sz w:val="40"/>
-                <w:szCs w:val="40"/>
-              </w:rPr>
-              <w:t xml:space="preserve"> }}</w:t>
-            </w:r>
-          </w:p>
-          <w:p>
-            <w:pPr>
-              <w:jc w:val="center"/>
-              <w:rPr>
-                <w:bCs/>
-                <w:sz w:val="40"/>
-                <w:szCs w:val="40"/>
-              </w:rPr>
-            </w:pPr>
-            <w:proofErr w:type="gramStart"/>
-            <w:r>
-              <w:rPr>
-                <w:bCs/>
-                <w:color w:val="FF0000"/>
-                <w:sz w:val="40"/>
-                <w:szCs w:val="40"/>
-                <w:rPrChange w:id="0" w:author="KETRY GORETE FARIAS DOS PASSOS" w:date="2026-04-14T09:47:00Z">
+                <w:sz w:val="24"/>
+                <w:szCs w:val="24"/>
+                <w:rPrChange w:id="8" w:author="KETRY GORETE FARIAS DOS PASSOS" w:date="2026-05-04T10:06:00Z">
                   <w:rPr>
                     <w:bCs/>
                     <w:sz w:val="40"/>
@@ -541,16 +357,14 @@
                   </w:rPr>
                 </w:rPrChange>
               </w:rPr>
-              <w:t xml:space="preserve">{{ </w:t>
-            </w:r>
-            <w:proofErr w:type="spellStart"/>
-            <w:r>
-              <w:rPr>
-                <w:bCs/>
-                <w:color w:val="FF0000"/>
-                <w:sz w:val="40"/>
-                <w:szCs w:val="40"/>
-                <w:rPrChange w:id="1" w:author="KETRY GORETE FARIAS DOS PASSOS" w:date="2026-04-14T09:47:00Z">
+            </w:pPr>
+            <w:proofErr w:type="gramStart"/>
+            <w:r>
+              <w:rPr>
+                <w:bCs/>
+                <w:sz w:val="24"/>
+                <w:szCs w:val="24"/>
+                <w:rPrChange w:id="9" w:author="KETRY GORETE FARIAS DOS PASSOS" w:date="2026-05-04T10:06:00Z">
                   <w:rPr>
                     <w:bCs/>
                     <w:sz w:val="40"/>
@@ -558,16 +372,15 @@
                   </w:rPr>
                 </w:rPrChange>
               </w:rPr>
-              <w:t>destaque</w:t>
+              <w:t>{{ assunto</w:t>
             </w:r>
             <w:proofErr w:type="gramEnd"/>
             <w:r>
               <w:rPr>
                 <w:bCs/>
-                <w:color w:val="FF0000"/>
-                <w:sz w:val="40"/>
-                <w:szCs w:val="40"/>
-                <w:rPrChange w:id="2" w:author="KETRY GORETE FARIAS DOS PASSOS" w:date="2026-04-14T09:47:00Z">
+                <w:sz w:val="24"/>
+                <w:szCs w:val="24"/>
+                <w:rPrChange w:id="10" w:author="KETRY GORETE FARIAS DOS PASSOS" w:date="2026-05-04T10:06:00Z">
                   <w:rPr>
                     <w:bCs/>
                     <w:sz w:val="40"/>
@@ -575,25 +388,172 @@
                   </w:rPr>
                 </w:rPrChange>
               </w:rPr>
-              <w:t>_permanente</w:t>
+              <w:t xml:space="preserve"> }}</w:t>
+            </w:r>
+          </w:p>
+          <w:p>
+            <w:pPr>
+              <w:jc w:val="center"/>
+              <w:rPr>
+                <w:b/>
+                <w:sz w:val="40"/>
+                <w:szCs w:val="40"/>
+              </w:rPr>
+            </w:pPr>
+            <w:r>
+              <w:rPr>
+                <w:b/>
+                <w:sz w:val="40"/>
+                <w:szCs w:val="40"/>
+              </w:rPr>
+              <w:t>Datas-limite:</w:t>
+            </w:r>
+          </w:p>
+          <w:p>
+            <w:pPr>
+              <w:jc w:val="center"/>
+              <w:rPr>
+                <w:bCs/>
+                <w:sz w:val="40"/>
+                <w:szCs w:val="40"/>
+              </w:rPr>
+            </w:pPr>
+            <w:proofErr w:type="gramStart"/>
+            <w:r>
+              <w:rPr>
+                <w:bCs/>
+                <w:sz w:val="40"/>
+                <w:szCs w:val="40"/>
+              </w:rPr>
+              <w:t xml:space="preserve">{{ </w:t>
+            </w:r>
+            <w:proofErr w:type="spellStart"/>
+            <w:r>
+              <w:rPr>
+                <w:bCs/>
+                <w:sz w:val="40"/>
+                <w:szCs w:val="40"/>
+              </w:rPr>
+              <w:t>datas</w:t>
+            </w:r>
+            <w:proofErr w:type="gramEnd"/>
+            <w:r>
+              <w:rPr>
+                <w:bCs/>
+                <w:sz w:val="40"/>
+                <w:szCs w:val="40"/>
+              </w:rPr>
+              <w:t>_limite</w:t>
+            </w:r>
+            <w:r>
+              <w:rPr>
+                <w:bCs/>
+                <w:sz w:val="40"/>
+                <w:szCs w:val="40"/>
+              </w:rPr>
+              <w:t>_resumo</w:t>
             </w:r>
             <w:proofErr w:type="spellEnd"/>
             <w:r>
               <w:rPr>
                 <w:bCs/>
-                <w:color w:val="FF0000"/>
-                <w:sz w:val="40"/>
-                <w:szCs w:val="40"/>
-                <w:rPrChange w:id="3" w:author="KETRY GORETE FARIAS DOS PASSOS" w:date="2026-04-14T09:47:00Z">
-                  <w:rPr>
-                    <w:bCs/>
-                    <w:sz w:val="40"/>
-                    <w:szCs w:val="40"/>
-                  </w:rPr>
-                </w:rPrChange>
+                <w:sz w:val="40"/>
+                <w:szCs w:val="40"/>
               </w:rPr>
               <w:t xml:space="preserve"> }}</w:t>
             </w:r>
+          </w:p>
+          <w:p>
+            <w:pPr>
+              <w:jc w:val="center"/>
+              <w:rPr>
+                <w:b/>
+                <w:sz w:val="40"/>
+                <w:szCs w:val="40"/>
+              </w:rPr>
+            </w:pPr>
+            <w:r>
+              <w:rPr>
+                <w:b/>
+                <w:sz w:val="40"/>
+                <w:szCs w:val="40"/>
+              </w:rPr>
+              <w:t>Destinação:</w:t>
+            </w:r>
+          </w:p>
+          <w:p>
+            <w:pPr>
+              <w:jc w:val="center"/>
+              <w:rPr>
+                <w:del w:id="11" w:author="KETRY GORETE FARIAS DOS PASSOS" w:date="2026-05-04T10:05:00Z"/>
+                <w:bCs/>
+                <w:sz w:val="40"/>
+                <w:szCs w:val="40"/>
+              </w:rPr>
+            </w:pPr>
+            <w:proofErr w:type="gramStart"/>
+            <w:r>
+              <w:rPr>
+                <w:bCs/>
+                <w:sz w:val="40"/>
+                <w:szCs w:val="40"/>
+              </w:rPr>
+              <w:t xml:space="preserve">{{ </w:t>
+            </w:r>
+            <w:proofErr w:type="spellStart"/>
+            <w:r>
+              <w:rPr>
+                <w:bCs/>
+                <w:sz w:val="40"/>
+                <w:szCs w:val="40"/>
+              </w:rPr>
+              <w:t>destinacao</w:t>
+            </w:r>
+            <w:proofErr w:type="spellEnd"/>
+            <w:proofErr w:type="gramEnd"/>
+            <w:r>
+              <w:rPr>
+                <w:bCs/>
+                <w:sz w:val="40"/>
+                <w:szCs w:val="40"/>
+              </w:rPr>
+              <w:t xml:space="preserve"> }}</w:t>
+            </w:r>
+          </w:p>
+          <w:p>
+            <w:pPr>
+              <w:jc w:val="center"/>
+              <w:rPr>
+                <w:bCs/>
+                <w:sz w:val="40"/>
+                <w:szCs w:val="40"/>
+              </w:rPr>
+              <w:pPrChange w:id="12" w:author="KETRY GORETE FARIAS DOS PASSOS" w:date="2026-05-04T10:05:00Z">
+                <w:pPr>
+                  <w:framePr w:hSpace="141" w:wrap="around" w:vAnchor="text" w:hAnchor="margin" w:xAlign="center" w:y="1"/>
+                  <w:suppressOverlap/>
+                  <w:jc w:val="center"/>
+                </w:pPr>
+              </w:pPrChange>
+            </w:pPr>
+            <w:del w:id="13" w:author="KETRY GORETE FARIAS DOS PASSOS" w:date="2026-05-04T10:05:00Z">
+              <w:r>
+                <w:rPr>
+                  <w:bCs/>
+                  <w:color w:val="FF0000"/>
+                  <w:sz w:val="40"/>
+                  <w:szCs w:val="40"/>
+                  <w:rPrChange w:id="14" w:author="KETRY GORETE FARIAS DOS PASSOS" w:date="2026-04-14T09:47:00Z">
+                    <w:rPr>
+                      <w:bCs/>
+                      <w:sz w:val="40"/>
+                      <w:szCs w:val="40"/>
+                    </w:rPr>
+                  </w:rPrChange>
+                </w:rPr>
+                <w:delText>{{ destaque_permanente }}</w:delText>
+              </w:r>
+            </w:del>
           </w:p>
         </w:tc>
       </w:tr>
@@ -1221,96 +1181,69 @@
               </w:rPr>
             </w:pPr>
             <w:proofErr w:type="gramStart"/>
-            <w:r>
-              <w:rPr>
-                <w:b/>
-                <w:sz w:val="56"/>
-                <w:szCs w:val="56"/>
-              </w:rPr>
-              <w:t>{{ f</w:t>
-            </w:r>
-            <w:r>
-              <w:rPr>
-                <w:b/>
-                <w:sz w:val="56"/>
-                <w:szCs w:val="56"/>
-              </w:rPr>
-              <w:t>u</w:t>
-            </w:r>
-            <w:r>
-              <w:rPr>
-                <w:b/>
-                <w:sz w:val="56"/>
-                <w:szCs w:val="56"/>
-              </w:rPr>
-              <w:t>ndo</w:t>
-            </w:r>
-            <w:proofErr w:type="gramEnd"/>
-            <w:r>
-              <w:rPr>
-                <w:b/>
-                <w:sz w:val="56"/>
-                <w:szCs w:val="56"/>
-              </w:rPr>
-              <w:t xml:space="preserve"> }}</w:t>
-            </w:r>
-          </w:p>
-        </w:tc>
-      </w:tr>
-      <w:tr>
-        <w:trPr>
-          <w:trHeight w:val="788"/>
-        </w:trPr>
-        <w:tc>
-          <w:tcPr>
-            <w:tcW w:w="6918" w:type="dxa"/>
-          </w:tcPr>
-          <w:p>
-            <w:pPr>
-              <w:spacing w:before="120" w:after="120"/>
-              <w:jc w:val="center"/>
-              <w:rPr>
-                <w:b/>
-                <w:sz w:val="40"/>
-                <w:szCs w:val="40"/>
-              </w:rPr>
-            </w:pPr>
-            <w:proofErr w:type="gramStart"/>
-            <w:r>
-              <w:rPr>
-                <w:b/>
-                <w:sz w:val="40"/>
-                <w:szCs w:val="40"/>
-              </w:rPr>
-              <w:t xml:space="preserve">{{ </w:t>
-            </w:r>
-            <w:proofErr w:type="spellStart"/>
-            <w:r>
-              <w:rPr>
-                <w:b/>
-                <w:sz w:val="40"/>
-                <w:szCs w:val="40"/>
-              </w:rPr>
-              <w:t>unidade</w:t>
-            </w:r>
-            <w:proofErr w:type="gramEnd"/>
-            <w:r>
-              <w:rPr>
-                <w:b/>
-                <w:sz w:val="40"/>
-                <w:szCs w:val="40"/>
-              </w:rPr>
-              <w:t>_documentacao</w:t>
-            </w:r>
-            <w:proofErr w:type="spellEnd"/>
-            <w:r>
-              <w:rPr>
-                <w:b/>
-                <w:sz w:val="40"/>
-                <w:szCs w:val="40"/>
-              </w:rPr>
-              <w:t xml:space="preserve"> }}</w:t>
-            </w:r>
+            <w:ins w:id="15" w:author="KETRY GORETE FARIAS DOS PASSOS" w:date="2026-05-04T10:05:00Z">
+              <w:r>
+                <w:rPr>
+                  <w:b/>
+                  <w:sz w:val="40"/>
+                  <w:szCs w:val="40"/>
+                </w:rPr>
+                <w:t xml:space="preserve">{{ </w:t>
+              </w:r>
+              <w:proofErr w:type="spellStart"/>
+              <w:r>
+                <w:rPr>
+                  <w:b/>
+                  <w:sz w:val="40"/>
+                  <w:szCs w:val="40"/>
+                </w:rPr>
+                <w:t>unidade</w:t>
+              </w:r>
+              <w:proofErr w:type="gramEnd"/>
+              <w:r>
+                <w:rPr>
+                  <w:b/>
+                  <w:sz w:val="40"/>
+                  <w:szCs w:val="40"/>
+                </w:rPr>
+                <w:t>_documentacao</w:t>
+              </w:r>
+              <w:proofErr w:type="spellEnd"/>
+              <w:r>
+                <w:rPr>
+                  <w:b/>
+                  <w:sz w:val="40"/>
+                  <w:szCs w:val="40"/>
+                </w:rPr>
+                <w:t xml:space="preserve"> }}</w:t>
+              </w:r>
+            </w:ins>
+            <w:del w:id="16" w:author="KETRY GORETE FARIAS DOS PASSOS" w:date="2026-05-04T10:05:00Z">
+              <w:r>
+                <w:rPr>
+                  <w:b/>
+                  <w:sz w:val="56"/>
+                  <w:szCs w:val="56"/>
+                </w:rPr>
+                <w:delText>{{ f</w:delText>
+              </w:r>
+              <w:r>
+                <w:rPr>
+                  <w:b/>
+                  <w:sz w:val="56"/>
+                  <w:szCs w:val="56"/>
+                </w:rPr>
+                <w:delText>u</w:delText>
+              </w:r>
+              <w:r>
+                <w:rPr>
+                  <w:b/>
+                  <w:sz w:val="56"/>
+                  <w:szCs w:val="56"/>
+                </w:rPr>
+                <w:delText>ndo }}</w:delText>
+              </w:r>
+            </w:del>
           </w:p>
         </w:tc>
       </w:tr>
@@ -1326,19 +1259,22 @@
             <w:pPr>
               <w:jc w:val="center"/>
               <w:rPr>
+                <w:ins w:id="17" w:author="KETRY GORETE FARIAS DOS PASSOS" w:date="2026-05-04T10:05:00Z"/>
                 <w:b/>
                 <w:sz w:val="40"/>
                 <w:szCs w:val="40"/>
               </w:rPr>
             </w:pPr>
-            <w:r>
-              <w:rPr>
-                <w:b/>
-                <w:sz w:val="40"/>
-                <w:szCs w:val="40"/>
-              </w:rPr>
-              <w:t>Datas detalhadas:</w:t>
-            </w:r>
+            <w:ins w:id="18" w:author="KETRY GORETE FARIAS DOS PASSOS" w:date="2026-05-04T10:05:00Z">
+              <w:r>
+                <w:rPr>
+                  <w:b/>
+                  <w:sz w:val="40"/>
+                  <w:szCs w:val="40"/>
+                </w:rPr>
+                <w:t>Datas detalhadas:</w:t>
+              </w:r>
+            </w:ins>
           </w:p>
           <w:p>
             <w:pPr>
@@ -1347,115 +1283,156 @@
                 <w:bCs/>
                 <w:sz w:val="40"/>
                 <w:szCs w:val="40"/>
-              </w:rPr>
+                <w:rPrChange w:id="19" w:author="KETRY GORETE FARIAS DOS PASSOS" w:date="2026-05-04T10:05:00Z">
+                  <w:rPr>
+                    <w:b/>
+                    <w:sz w:val="40"/>
+                    <w:szCs w:val="40"/>
+                  </w:rPr>
+                </w:rPrChange>
+              </w:rPr>
+              <w:pPrChange w:id="20" w:author="KETRY GORETE FARIAS DOS PASSOS" w:date="2026-05-04T10:05:00Z">
+                <w:pPr>
+                  <w:framePr w:hSpace="141" w:wrap="around" w:vAnchor="text" w:hAnchor="margin" w:xAlign="center" w:y="1"/>
+                  <w:spacing w:before="120" w:after="120"/>
+                  <w:suppressOverlap/>
+                  <w:jc w:val="center"/>
+                </w:pPr>
+              </w:pPrChange>
             </w:pPr>
             <w:proofErr w:type="gramStart"/>
-            <w:r>
-              <w:rPr>
-                <w:bCs/>
-                <w:sz w:val="40"/>
-                <w:szCs w:val="40"/>
-              </w:rPr>
-              <w:t xml:space="preserve">{{ </w:t>
-            </w:r>
-            <w:proofErr w:type="spellStart"/>
-            <w:r>
-              <w:rPr>
-                <w:bCs/>
-                <w:sz w:val="40"/>
-                <w:szCs w:val="40"/>
-              </w:rPr>
-              <w:t>datas</w:t>
-            </w:r>
-            <w:proofErr w:type="gramEnd"/>
-            <w:r>
-              <w:rPr>
-                <w:bCs/>
-                <w:sz w:val="40"/>
-                <w:szCs w:val="40"/>
-              </w:rPr>
-              <w:t>_limite</w:t>
-            </w:r>
-            <w:r>
-              <w:rPr>
-                <w:bCs/>
-                <w:sz w:val="40"/>
-                <w:szCs w:val="40"/>
-              </w:rPr>
-              <w:t>_detalhadas</w:t>
-            </w:r>
-            <w:proofErr w:type="spellEnd"/>
-            <w:r>
-              <w:rPr>
-                <w:bCs/>
-                <w:sz w:val="40"/>
-                <w:szCs w:val="40"/>
-              </w:rPr>
-              <w:t xml:space="preserve"> }}</w:t>
-            </w:r>
+            <w:ins w:id="21" w:author="KETRY GORETE FARIAS DOS PASSOS" w:date="2026-05-04T10:05:00Z">
+              <w:r>
+                <w:rPr>
+                  <w:bCs/>
+                  <w:sz w:val="40"/>
+                  <w:szCs w:val="40"/>
+                </w:rPr>
+                <w:t xml:space="preserve">{{ </w:t>
+              </w:r>
+              <w:proofErr w:type="spellStart"/>
+              <w:r>
+                <w:rPr>
+                  <w:bCs/>
+                  <w:sz w:val="40"/>
+                  <w:szCs w:val="40"/>
+                </w:rPr>
+                <w:t>datas</w:t>
+              </w:r>
+              <w:proofErr w:type="gramEnd"/>
+              <w:r>
+                <w:rPr>
+                  <w:bCs/>
+                  <w:sz w:val="40"/>
+                  <w:szCs w:val="40"/>
+                </w:rPr>
+                <w:t>_limite_detalhadas</w:t>
+              </w:r>
+              <w:proofErr w:type="spellEnd"/>
+              <w:r>
+                <w:rPr>
+                  <w:bCs/>
+                  <w:sz w:val="40"/>
+                  <w:szCs w:val="40"/>
+                </w:rPr>
+                <w:t xml:space="preserve"> }}</w:t>
+              </w:r>
+            </w:ins>
+            <w:del w:id="22" w:author="KETRY GORETE FARIAS DOS PASSOS" w:date="2026-05-04T10:05:00Z">
+              <w:r>
+                <w:rPr>
+                  <w:b/>
+                  <w:sz w:val="40"/>
+                  <w:szCs w:val="40"/>
+                </w:rPr>
+                <w:delText>{{ unidade_documentacao }}</w:delText>
+              </w:r>
+            </w:del>
+          </w:p>
+        </w:tc>
+      </w:tr>
+      <w:tr>
+        <w:trPr>
+          <w:trHeight w:val="788"/>
+        </w:trPr>
+        <w:tc>
+          <w:tcPr>
+            <w:tcW w:w="6918" w:type="dxa"/>
+          </w:tcPr>
+          <w:p>
+            <w:pPr>
+              <w:jc w:val="center"/>
+              <w:rPr>
+                <w:del w:id="23" w:author="KETRY GORETE FARIAS DOS PASSOS" w:date="2026-05-04T10:05:00Z"/>
+                <w:b/>
+                <w:sz w:val="40"/>
+                <w:szCs w:val="40"/>
+              </w:rPr>
+            </w:pPr>
+            <w:del w:id="24" w:author="KETRY GORETE FARIAS DOS PASSOS" w:date="2026-05-04T10:05:00Z">
+              <w:r>
+                <w:rPr>
+                  <w:b/>
+                  <w:sz w:val="40"/>
+                  <w:szCs w:val="40"/>
+                </w:rPr>
+                <w:delText>Datas detalhadas:</w:delText>
+              </w:r>
+            </w:del>
           </w:p>
           <w:p>
             <w:pPr>
               <w:jc w:val="center"/>
               <w:rPr>
-                <w:b/>
+                <w:del w:id="25" w:author="KETRY GORETE FARIAS DOS PASSOS" w:date="2026-05-04T10:05:00Z"/>
+                <w:bCs/>
                 <w:sz w:val="40"/>
                 <w:szCs w:val="40"/>
               </w:rPr>
             </w:pPr>
-            <w:r>
-              <w:rPr>
-                <w:b/>
-                <w:sz w:val="40"/>
-                <w:szCs w:val="40"/>
-              </w:rPr>
-              <w:t>Prazo de guarda:</w:t>
-            </w:r>
+            <w:del w:id="26" w:author="KETRY GORETE FARIAS DOS PASSOS" w:date="2026-05-04T10:05:00Z">
+              <w:r>
+                <w:rPr>
+                  <w:bCs/>
+                  <w:sz w:val="40"/>
+                  <w:szCs w:val="40"/>
+                </w:rPr>
+                <w:delText>{{ datas_limite</w:delText>
+              </w:r>
+              <w:r>
+                <w:rPr>
+                  <w:bCs/>
+                  <w:sz w:val="40"/>
+                  <w:szCs w:val="40"/>
+                </w:rPr>
+                <w:delText>_detalhadas</w:delText>
+              </w:r>
+              <w:r>
+                <w:rPr>
+                  <w:bCs/>
+                  <w:sz w:val="40"/>
+                  <w:szCs w:val="40"/>
+                </w:rPr>
+                <w:delText xml:space="preserve"> }}</w:delText>
+              </w:r>
+            </w:del>
           </w:p>
           <w:p>
             <w:pPr>
               <w:jc w:val="center"/>
               <w:rPr>
-                <w:bCs/>
+                <w:b/>
                 <w:sz w:val="40"/>
                 <w:szCs w:val="40"/>
               </w:rPr>
             </w:pPr>
-            <w:proofErr w:type="gramStart"/>
-            <w:r>
-              <w:rPr>
-                <w:bCs/>
-                <w:sz w:val="40"/>
-                <w:szCs w:val="40"/>
-              </w:rPr>
-              <w:t xml:space="preserve">{{ </w:t>
-            </w:r>
-            <w:proofErr w:type="spellStart"/>
-            <w:r>
-              <w:rPr>
-                <w:bCs/>
-                <w:sz w:val="40"/>
-                <w:szCs w:val="40"/>
-              </w:rPr>
-              <w:t>prazo</w:t>
-            </w:r>
-            <w:proofErr w:type="gramEnd"/>
-            <w:r>
-              <w:rPr>
-                <w:bCs/>
-                <w:sz w:val="40"/>
-                <w:szCs w:val="40"/>
-              </w:rPr>
-              <w:t>_corrente</w:t>
-            </w:r>
-            <w:proofErr w:type="spellEnd"/>
-            <w:r>
-              <w:rPr>
-                <w:bCs/>
-                <w:sz w:val="40"/>
-                <w:szCs w:val="40"/>
-              </w:rPr>
-              <w:t xml:space="preserve"> }}</w:t>
+            <w:r>
+              <w:rPr>
+                <w:b/>
+                <w:sz w:val="40"/>
+                <w:szCs w:val="40"/>
+              </w:rPr>
+              <w:t>Prazo de guarda:</w:t>
             </w:r>
           </w:p>
           <w:p>
@@ -1492,7 +1469,7 @@
                 <w:sz w:val="40"/>
                 <w:szCs w:val="40"/>
               </w:rPr>
-              <w:t>_intermediario</w:t>
+              <w:t>_corrente</w:t>
             </w:r>
             <w:proofErr w:type="spellEnd"/>
             <w:r>
@@ -1501,31 +1478,77 @@
                 <w:sz w:val="40"/>
                 <w:szCs w:val="40"/>
               </w:rPr>
-              <w:t>}}</w:t>
+              <w:t xml:space="preserve"> }}</w:t>
             </w:r>
           </w:p>
           <w:p>
             <w:pPr>
               <w:jc w:val="center"/>
               <w:rPr>
-                <w:b/>
+                <w:bCs/>
                 <w:sz w:val="40"/>
                 <w:szCs w:val="40"/>
               </w:rPr>
             </w:pPr>
-            <w:r>
-              <w:rPr>
-                <w:b/>
-                <w:sz w:val="40"/>
-                <w:szCs w:val="40"/>
-              </w:rPr>
-              <w:t>Destinação:</w:t>
+            <w:proofErr w:type="gramStart"/>
+            <w:r>
+              <w:rPr>
+                <w:bCs/>
+                <w:sz w:val="40"/>
+                <w:szCs w:val="40"/>
+              </w:rPr>
+              <w:t xml:space="preserve">{{ </w:t>
+            </w:r>
+            <w:proofErr w:type="spellStart"/>
+            <w:r>
+              <w:rPr>
+                <w:bCs/>
+                <w:sz w:val="40"/>
+                <w:szCs w:val="40"/>
+              </w:rPr>
+              <w:t>prazo</w:t>
+            </w:r>
+            <w:proofErr w:type="gramEnd"/>
+            <w:r>
+              <w:rPr>
+                <w:bCs/>
+                <w:sz w:val="40"/>
+                <w:szCs w:val="40"/>
+              </w:rPr>
+              <w:t>_intermediario</w:t>
+            </w:r>
+            <w:proofErr w:type="spellEnd"/>
+            <w:r>
+              <w:rPr>
+                <w:bCs/>
+                <w:sz w:val="40"/>
+                <w:szCs w:val="40"/>
+              </w:rPr>
+              <w:t>}}</w:t>
             </w:r>
           </w:p>
           <w:p>
             <w:pPr>
               <w:jc w:val="center"/>
               <w:rPr>
+                <w:b/>
+                <w:sz w:val="40"/>
+                <w:szCs w:val="40"/>
+              </w:rPr>
+            </w:pPr>
+            <w:r>
+              <w:rPr>
+                <w:b/>
+                <w:sz w:val="40"/>
+                <w:szCs w:val="40"/>
+              </w:rPr>
+              <w:t>Destinação:</w:t>
+            </w:r>
+          </w:p>
+          <w:p>
+            <w:pPr>
+              <w:jc w:val="center"/>
+              <w:rPr>
                 <w:bCs/>
                 <w:sz w:val="40"/>
                 <w:szCs w:val="40"/>
@@ -1538,7 +1561,7 @@
                 <w:color w:val="FF0000"/>
                 <w:sz w:val="40"/>
                 <w:szCs w:val="40"/>
-                <w:rPrChange w:id="4" w:author="KETRY GORETE FARIAS DOS PASSOS" w:date="2026-04-14T09:47:00Z">
+                <w:rPrChange w:id="27" w:author="KETRY GORETE FARIAS DOS PASSOS" w:date="2026-04-14T09:47:00Z">
                   <w:rPr>
                     <w:bCs/>
                     <w:sz w:val="40"/>
@@ -1555,7 +1578,7 @@
                 <w:color w:val="FF0000"/>
                 <w:sz w:val="40"/>
                 <w:szCs w:val="40"/>
-                <w:rPrChange w:id="5" w:author="KETRY GORETE FARIAS DOS PASSOS" w:date="2026-04-14T09:47:00Z">
+                <w:rPrChange w:id="28" w:author="KETRY GORETE FARIAS DOS PASSOS" w:date="2026-04-14T09:47:00Z">
                   <w:rPr>
                     <w:bCs/>
                     <w:sz w:val="40"/>
@@ -1573,7 +1596,7 @@
                 <w:color w:val="FF0000"/>
                 <w:sz w:val="40"/>
                 <w:szCs w:val="40"/>
-                <w:rPrChange w:id="6" w:author="KETRY GORETE FARIAS DOS PASSOS" w:date="2026-04-14T09:47:00Z">
+                <w:rPrChange w:id="29" w:author="KETRY GORETE FARIAS DOS PASSOS" w:date="2026-04-14T09:47:00Z">
                   <w:rPr>
                     <w:bCs/>
                     <w:sz w:val="40"/>
@@ -1599,16 +1622,30 @@
               <w:jc w:val="center"/>
               <w:rPr>
                 <w:b/>
-                <w:sz w:val="40"/>
-                <w:szCs w:val="40"/>
+                <w:sz w:val="28"/>
+                <w:szCs w:val="28"/>
+                <w:rPrChange w:id="30" w:author="KETRY GORETE FARIAS DOS PASSOS" w:date="2026-05-04T10:06:00Z">
+                  <w:rPr>
+                    <w:b/>
+                    <w:sz w:val="40"/>
+                    <w:szCs w:val="40"/>
+                  </w:rPr>
+                </w:rPrChange>
               </w:rPr>
             </w:pPr>
             <w:proofErr w:type="gramStart"/>
             <w:r>
               <w:rPr>
                 <w:b/>
-                <w:sz w:val="40"/>
-                <w:szCs w:val="40"/>
+                <w:sz w:val="28"/>
+                <w:szCs w:val="28"/>
+                <w:rPrChange w:id="31" w:author="KETRY GORETE FARIAS DOS PASSOS" w:date="2026-05-04T10:06:00Z">
+                  <w:rPr>
+                    <w:b/>
+                    <w:sz w:val="40"/>
+                    <w:szCs w:val="40"/>
+                  </w:rPr>
+                </w:rPrChange>
               </w:rPr>
               <w:t xml:space="preserve">{{ </w:t>
             </w:r>
@@ -1616,8 +1653,15 @@
             <w:r>
               <w:rPr>
                 <w:b/>
-                <w:sz w:val="40"/>
-                <w:szCs w:val="40"/>
+                <w:sz w:val="28"/>
+                <w:szCs w:val="28"/>
+                <w:rPrChange w:id="32" w:author="KETRY GORETE FARIAS DOS PASSOS" w:date="2026-05-04T10:06:00Z">
+                  <w:rPr>
+                    <w:b/>
+                    <w:sz w:val="40"/>
+                    <w:szCs w:val="40"/>
+                  </w:rPr>
+                </w:rPrChange>
               </w:rPr>
               <w:t>observacao</w:t>
             </w:r>
@@ -1626,8 +1670,15 @@
             <w:r>
               <w:rPr>
                 <w:b/>
-                <w:sz w:val="40"/>
-                <w:szCs w:val="40"/>
+                <w:sz w:val="28"/>
+                <w:szCs w:val="28"/>
+                <w:rPrChange w:id="33" w:author="KETRY GORETE FARIAS DOS PASSOS" w:date="2026-05-04T10:06:00Z">
+                  <w:rPr>
+                    <w:b/>
+                    <w:sz w:val="40"/>
+                    <w:szCs w:val="40"/>
+                  </w:rPr>
+                </w:rPrChange>
               </w:rPr>
               <w:t xml:space="preserve"> }}</w:t>
             </w:r>
@@ -1645,8 +1696,15 @@
             <w:r>
               <w:rPr>
                 <w:bCs/>
-                <w:sz w:val="40"/>
-                <w:szCs w:val="40"/>
+                <w:sz w:val="28"/>
+                <w:szCs w:val="28"/>
+                <w:rPrChange w:id="34" w:author="KETRY GORETE FARIAS DOS PASSOS" w:date="2026-05-04T10:06:00Z">
+                  <w:rPr>
+                    <w:bCs/>
+                    <w:sz w:val="40"/>
+                    <w:szCs w:val="40"/>
+                  </w:rPr>
+                </w:rPrChange>
               </w:rPr>
               <w:t xml:space="preserve">{{ </w:t>
             </w:r>
@@ -1654,8 +1712,15 @@
             <w:r>
               <w:rPr>
                 <w:bCs/>
-                <w:sz w:val="40"/>
-                <w:szCs w:val="40"/>
+                <w:sz w:val="28"/>
+                <w:szCs w:val="28"/>
+                <w:rPrChange w:id="35" w:author="KETRY GORETE FARIAS DOS PASSOS" w:date="2026-05-04T10:06:00Z">
+                  <w:rPr>
+                    <w:bCs/>
+                    <w:sz w:val="40"/>
+                    <w:szCs w:val="40"/>
+                  </w:rPr>
+                </w:rPrChange>
               </w:rPr>
               <w:t>lista</w:t>
             </w:r>
@@ -1663,8 +1728,15 @@
             <w:r>
               <w:rPr>
                 <w:bCs/>
-                <w:sz w:val="40"/>
-                <w:szCs w:val="40"/>
+                <w:sz w:val="28"/>
+                <w:szCs w:val="28"/>
+                <w:rPrChange w:id="36" w:author="KETRY GORETE FARIAS DOS PASSOS" w:date="2026-05-04T10:06:00Z">
+                  <w:rPr>
+                    <w:bCs/>
+                    <w:sz w:val="40"/>
+                    <w:szCs w:val="40"/>
+                  </w:rPr>
+                </w:rPrChange>
               </w:rPr>
               <w:t>_itens_caixa</w:t>
             </w:r>
@@ -1672,8 +1744,15 @@
             <w:r>
               <w:rPr>
                 <w:bCs/>
-                <w:sz w:val="40"/>
-                <w:szCs w:val="40"/>
+                <w:sz w:val="28"/>
+                <w:szCs w:val="28"/>
+                <w:rPrChange w:id="37" w:author="KETRY GORETE FARIAS DOS PASSOS" w:date="2026-05-04T10:06:00Z">
+                  <w:rPr>
+                    <w:bCs/>
+                    <w:sz w:val="40"/>
+                    <w:szCs w:val="40"/>
+                  </w:rPr>
+                </w:rPrChange>
               </w:rPr>
               <w:t xml:space="preserve"> }}</w:t>
             </w:r>

</xml_diff>